<commit_message>
course paper data structures
</commit_message>
<xml_diff>
--- a/Наумов_Мухтаров_Пояснительная_записка.docx
+++ b/Наумов_Мухтаров_Пояснительная_записка.docx
@@ -479,7 +479,7 @@
         </w:p>
         <w:p>
           <w:pPr>
-            <w:pStyle w:val="20"/>
+            <w:pStyle w:val="21"/>
             <w:tabs>
               <w:tab w:val="right" w:leader="dot" w:pos="9344"/>
             </w:tabs>
@@ -664,7 +664,7 @@
         </w:p>
         <w:p>
           <w:pPr>
-            <w:pStyle w:val="20"/>
+            <w:pStyle w:val="21"/>
             <w:tabs>
               <w:tab w:val="right" w:leader="dot" w:pos="9344"/>
             </w:tabs>
@@ -725,7 +725,7 @@
         </w:p>
         <w:p>
           <w:pPr>
-            <w:pStyle w:val="20"/>
+            <w:pStyle w:val="21"/>
             <w:tabs>
               <w:tab w:val="right" w:leader="dot" w:pos="9344"/>
             </w:tabs>
@@ -786,7 +786,7 @@
         </w:p>
         <w:p>
           <w:pPr>
-            <w:pStyle w:val="20"/>
+            <w:pStyle w:val="21"/>
             <w:tabs>
               <w:tab w:val="right" w:leader="dot" w:pos="9344"/>
             </w:tabs>
@@ -1219,7 +1219,7 @@
         </w:p>
         <w:p>
           <w:pPr>
-            <w:pStyle w:val="20"/>
+            <w:pStyle w:val="21"/>
             <w:tabs>
               <w:tab w:val="right" w:leader="dot" w:pos="9344"/>
             </w:tabs>
@@ -1280,7 +1280,7 @@
         </w:p>
         <w:p>
           <w:pPr>
-            <w:pStyle w:val="20"/>
+            <w:pStyle w:val="21"/>
             <w:tabs>
               <w:tab w:val="right" w:leader="dot" w:pos="9344"/>
             </w:tabs>
@@ -1341,7 +1341,7 @@
         </w:p>
         <w:p>
           <w:pPr>
-            <w:pStyle w:val="20"/>
+            <w:pStyle w:val="21"/>
             <w:tabs>
               <w:tab w:val="right" w:leader="dot" w:pos="9344"/>
             </w:tabs>
@@ -1402,7 +1402,7 @@
         </w:p>
         <w:p>
           <w:pPr>
-            <w:pStyle w:val="20"/>
+            <w:pStyle w:val="21"/>
             <w:tabs>
               <w:tab w:val="right" w:leader="dot" w:pos="9344"/>
             </w:tabs>
@@ -1463,7 +1463,7 @@
         </w:p>
         <w:p>
           <w:pPr>
-            <w:pStyle w:val="20"/>
+            <w:pStyle w:val="21"/>
             <w:tabs>
               <w:tab w:val="right" w:leader="dot" w:pos="9344"/>
             </w:tabs>
@@ -1524,7 +1524,7 @@
         </w:p>
         <w:p>
           <w:pPr>
-            <w:pStyle w:val="20"/>
+            <w:pStyle w:val="21"/>
             <w:tabs>
               <w:tab w:val="right" w:leader="dot" w:pos="9344"/>
             </w:tabs>
@@ -1647,7 +1647,7 @@
         </w:p>
         <w:p>
           <w:pPr>
-            <w:pStyle w:val="20"/>
+            <w:pStyle w:val="21"/>
             <w:tabs>
               <w:tab w:val="right" w:leader="dot" w:pos="9344"/>
             </w:tabs>
@@ -1708,7 +1708,7 @@
         </w:p>
         <w:p>
           <w:pPr>
-            <w:pStyle w:val="20"/>
+            <w:pStyle w:val="21"/>
             <w:tabs>
               <w:tab w:val="right" w:leader="dot" w:pos="9344"/>
             </w:tabs>
@@ -1831,7 +1831,7 @@
         </w:p>
         <w:p>
           <w:pPr>
-            <w:pStyle w:val="20"/>
+            <w:pStyle w:val="21"/>
             <w:tabs>
               <w:tab w:val="right" w:leader="dot" w:pos="9344"/>
             </w:tabs>
@@ -1892,7 +1892,7 @@
         </w:p>
         <w:p>
           <w:pPr>
-            <w:pStyle w:val="20"/>
+            <w:pStyle w:val="21"/>
             <w:tabs>
               <w:tab w:val="right" w:leader="dot" w:pos="9344"/>
             </w:tabs>
@@ -1953,7 +1953,7 @@
         </w:p>
         <w:p>
           <w:pPr>
-            <w:pStyle w:val="20"/>
+            <w:pStyle w:val="21"/>
             <w:tabs>
               <w:tab w:val="right" w:leader="dot" w:pos="9344"/>
             </w:tabs>
@@ -2014,7 +2014,7 @@
         </w:p>
         <w:p>
           <w:pPr>
-            <w:pStyle w:val="20"/>
+            <w:pStyle w:val="21"/>
             <w:tabs>
               <w:tab w:val="right" w:leader="dot" w:pos="9344"/>
             </w:tabs>
@@ -2137,7 +2137,7 @@
         </w:p>
         <w:p>
           <w:pPr>
-            <w:pStyle w:val="20"/>
+            <w:pStyle w:val="21"/>
             <w:tabs>
               <w:tab w:val="right" w:leader="dot" w:pos="9344"/>
             </w:tabs>
@@ -2198,7 +2198,7 @@
         </w:p>
         <w:p>
           <w:pPr>
-            <w:pStyle w:val="20"/>
+            <w:pStyle w:val="21"/>
             <w:tabs>
               <w:tab w:val="right" w:leader="dot" w:pos="9344"/>
             </w:tabs>
@@ -2259,7 +2259,7 @@
         </w:p>
         <w:p>
           <w:pPr>
-            <w:pStyle w:val="20"/>
+            <w:pStyle w:val="21"/>
             <w:tabs>
               <w:tab w:val="right" w:leader="dot" w:pos="9344"/>
             </w:tabs>
@@ -2320,7 +2320,7 @@
         </w:p>
         <w:p>
           <w:pPr>
-            <w:pStyle w:val="20"/>
+            <w:pStyle w:val="21"/>
             <w:tabs>
               <w:tab w:val="right" w:leader="dot" w:pos="9344"/>
             </w:tabs>
@@ -2381,7 +2381,7 @@
         </w:p>
         <w:p>
           <w:pPr>
-            <w:pStyle w:val="20"/>
+            <w:pStyle w:val="21"/>
             <w:tabs>
               <w:tab w:val="right" w:leader="dot" w:pos="9344"/>
             </w:tabs>
@@ -2504,7 +2504,7 @@
         </w:p>
         <w:p>
           <w:pPr>
-            <w:pStyle w:val="20"/>
+            <w:pStyle w:val="21"/>
             <w:tabs>
               <w:tab w:val="right" w:leader="dot" w:pos="9344"/>
             </w:tabs>
@@ -2751,7 +2751,7 @@
         </w:p>
         <w:p>
           <w:pPr>
-            <w:pStyle w:val="20"/>
+            <w:pStyle w:val="21"/>
             <w:tabs>
               <w:tab w:val="right" w:leader="dot" w:pos="9344"/>
             </w:tabs>
@@ -2812,7 +2812,7 @@
         </w:p>
         <w:p>
           <w:pPr>
-            <w:pStyle w:val="20"/>
+            <w:pStyle w:val="21"/>
             <w:tabs>
               <w:tab w:val="right" w:leader="dot" w:pos="9344"/>
             </w:tabs>
@@ -2873,7 +2873,7 @@
         </w:p>
         <w:p>
           <w:pPr>
-            <w:pStyle w:val="20"/>
+            <w:pStyle w:val="21"/>
             <w:tabs>
               <w:tab w:val="right" w:leader="dot" w:pos="9344"/>
             </w:tabs>
@@ -2934,7 +2934,7 @@
         </w:p>
         <w:p>
           <w:pPr>
-            <w:pStyle w:val="20"/>
+            <w:pStyle w:val="21"/>
             <w:tabs>
               <w:tab w:val="right" w:leader="dot" w:pos="9344"/>
             </w:tabs>
@@ -3057,7 +3057,7 @@
         </w:p>
         <w:p>
           <w:pPr>
-            <w:pStyle w:val="20"/>
+            <w:pStyle w:val="21"/>
             <w:tabs>
               <w:tab w:val="right" w:leader="dot" w:pos="9344"/>
             </w:tabs>
@@ -3118,7 +3118,7 @@
         </w:p>
         <w:p>
           <w:pPr>
-            <w:pStyle w:val="20"/>
+            <w:pStyle w:val="21"/>
             <w:tabs>
               <w:tab w:val="right" w:leader="dot" w:pos="9344"/>
             </w:tabs>
@@ -3179,7 +3179,7 @@
         </w:p>
         <w:p>
           <w:pPr>
-            <w:pStyle w:val="20"/>
+            <w:pStyle w:val="21"/>
             <w:tabs>
               <w:tab w:val="right" w:leader="dot" w:pos="9344"/>
             </w:tabs>
@@ -3240,7 +3240,7 @@
         </w:p>
         <w:p>
           <w:pPr>
-            <w:pStyle w:val="20"/>
+            <w:pStyle w:val="21"/>
             <w:tabs>
               <w:tab w:val="right" w:leader="dot" w:pos="9344"/>
             </w:tabs>
@@ -3363,7 +3363,7 @@
         </w:p>
         <w:p>
           <w:pPr>
-            <w:pStyle w:val="20"/>
+            <w:pStyle w:val="21"/>
             <w:tabs>
               <w:tab w:val="right" w:leader="dot" w:pos="9344"/>
             </w:tabs>
@@ -3424,7 +3424,7 @@
         </w:p>
         <w:p>
           <w:pPr>
-            <w:pStyle w:val="20"/>
+            <w:pStyle w:val="21"/>
             <w:tabs>
               <w:tab w:val="right" w:leader="dot" w:pos="9344"/>
             </w:tabs>
@@ -5457,15 +5457,7 @@
         </w:numPr>
       </w:pPr>
       <w:r>
-        <w:t>Статусы сметы: Черновик</w:t>
-      </w:r>
-      <w:proofErr w:type="gramStart"/>
-      <w:r>
-        <w:t>, На</w:t>
-      </w:r>
-      <w:proofErr w:type="gramEnd"/>
-      <w:r>
-        <w:t xml:space="preserve"> проверке, Утверждена, Отклонена, Архив.</w:t>
+        <w:t>Статусы сметы: Черновик, На проверке, Утверждена, Отклонена, Архив.</w:t>
       </w:r>
     </w:p>
     <w:p>
@@ -10183,14 +10175,6 @@
     <w:p/>
     <w:p/>
     <w:p/>
-    <w:p/>
-    <w:p/>
-    <w:p/>
-    <w:p/>
-    <w:p/>
-    <w:p/>
-    <w:p/>
-    <w:p/>
     <w:p>
       <w:pPr>
         <w:pStyle w:val="2"/>
@@ -10198,6 +10182,7 @@
       </w:pPr>
       <w:bookmarkStart w:id="23" w:name="_Toc230630469"/>
       <w:r>
+        <w:lastRenderedPageBreak/>
         <w:t>5.2 Диаграмма сущность–связь (ER)</w:t>
       </w:r>
       <w:bookmarkEnd w:id="23"/>
@@ -10953,7 +10938,6 @@
             </w:pPr>
             <w:proofErr w:type="spellStart"/>
             <w:r>
-              <w:lastRenderedPageBreak/>
               <w:t>EstimateItem</w:t>
             </w:r>
             <w:proofErr w:type="spellEnd"/>
@@ -11169,6 +11153,7 @@
               <w:spacing w:after="60" w:line="280" w:lineRule="auto"/>
             </w:pPr>
             <w:r>
+              <w:lastRenderedPageBreak/>
               <w:t>Act</w:t>
             </w:r>
           </w:p>
@@ -11705,6 +11690,1626 @@
           </wp:inline>
         </w:drawing>
       </w:r>
+    </w:p>
+    <w:p>
+      <w:pPr>
+        <w:jc w:val="center"/>
+      </w:pPr>
+    </w:p>
+    <w:p>
+      <w:pPr>
+        <w:jc w:val="center"/>
+      </w:pPr>
+    </w:p>
+    <w:p>
+      <w:pPr>
+        <w:jc w:val="center"/>
+      </w:pPr>
+    </w:p>
+    <w:p>
+      <w:pPr>
+        <w:jc w:val="center"/>
+      </w:pPr>
+    </w:p>
+    <w:p>
+      <w:pPr>
+        <w:jc w:val="center"/>
+      </w:pPr>
+    </w:p>
+    <w:p>
+      <w:pPr>
+        <w:jc w:val="center"/>
+      </w:pPr>
+    </w:p>
+    <w:p>
+      <w:pPr>
+        <w:jc w:val="center"/>
+      </w:pPr>
+    </w:p>
+    <w:p>
+      <w:pPr>
+        <w:jc w:val="center"/>
+      </w:pPr>
+    </w:p>
+    <w:p>
+      <w:pPr>
+        <w:jc w:val="center"/>
+      </w:pPr>
+    </w:p>
+    <w:p>
+      <w:pPr>
+        <w:jc w:val="center"/>
+      </w:pPr>
+    </w:p>
+    <w:p>
+      <w:pPr>
+        <w:jc w:val="center"/>
+      </w:pPr>
+    </w:p>
+    <w:p>
+      <w:pPr>
+        <w:jc w:val="center"/>
+      </w:pPr>
+    </w:p>
+    <w:p>
+      <w:pPr>
+        <w:jc w:val="center"/>
+      </w:pPr>
+    </w:p>
+    <w:p>
+      <w:pPr>
+        <w:jc w:val="center"/>
+      </w:pPr>
+    </w:p>
+    <w:p>
+      <w:pPr>
+        <w:jc w:val="center"/>
+      </w:pPr>
+    </w:p>
+    <w:p>
+      <w:pPr>
+        <w:jc w:val="center"/>
+      </w:pPr>
+    </w:p>
+    <w:p>
+      <w:pPr>
+        <w:jc w:val="center"/>
+      </w:pPr>
+    </w:p>
+    <w:p>
+      <w:pPr>
+        <w:jc w:val="center"/>
+      </w:pPr>
+    </w:p>
+    <w:p>
+      <w:pPr>
+        <w:jc w:val="center"/>
+      </w:pPr>
+    </w:p>
+    <w:p>
+      <w:pPr>
+        <w:pStyle w:val="2"/>
+        <w:spacing w:line="360" w:lineRule="auto"/>
+      </w:pPr>
+      <w:r>
+        <w:lastRenderedPageBreak/>
+        <w:t>5.</w:t>
+      </w:r>
+      <w:r>
+        <w:t>3</w:t>
+      </w:r>
+      <w:r>
+        <w:t xml:space="preserve"> </w:t>
+      </w:r>
+      <w:r>
+        <w:t>Структура данных</w:t>
+      </w:r>
+    </w:p>
+    <w:p>
+      <w:pPr>
+        <w:spacing w:after="100" w:line="360" w:lineRule="auto"/>
+        <w:ind w:firstLine="709"/>
+        <w:jc w:val="both"/>
+      </w:pPr>
+      <w:r>
+        <w:t xml:space="preserve">Диаграмма классов показывает объектную модель предметной области и фиксирует структуру будущей программной реализации. </w:t>
+      </w:r>
+    </w:p>
+    <w:p>
+      <w:pPr>
+        <w:spacing w:after="100" w:line="360" w:lineRule="auto"/>
+        <w:ind w:firstLine="709"/>
+        <w:jc w:val="both"/>
+      </w:pPr>
+      <w:r>
+        <w:t>User представляет сотрудника системы.</w:t>
+      </w:r>
+      <w:r>
+        <w:t xml:space="preserve"> </w:t>
+      </w:r>
+      <w:r>
+        <w:t>Свойства</w:t>
+      </w:r>
+      <w:r>
+        <w:rPr>
+          <w:lang w:val="en-US"/>
+        </w:rPr>
+        <w:t xml:space="preserve">: id, email, username, </w:t>
+      </w:r>
+      <w:proofErr w:type="spellStart"/>
+      <w:r>
+        <w:rPr>
+          <w:lang w:val="en-US"/>
+        </w:rPr>
+        <w:t>fullName</w:t>
+      </w:r>
+      <w:proofErr w:type="spellEnd"/>
+      <w:r>
+        <w:rPr>
+          <w:lang w:val="en-US"/>
+        </w:rPr>
+        <w:t xml:space="preserve">, </w:t>
+      </w:r>
+      <w:proofErr w:type="spellStart"/>
+      <w:r>
+        <w:rPr>
+          <w:lang w:val="en-US"/>
+        </w:rPr>
+        <w:t>jobTitle</w:t>
+      </w:r>
+      <w:proofErr w:type="spellEnd"/>
+      <w:r>
+        <w:rPr>
+          <w:lang w:val="en-US"/>
+        </w:rPr>
+        <w:t>, phone.</w:t>
+      </w:r>
+      <w:r>
+        <w:rPr>
+          <w:lang w:val="en-US"/>
+        </w:rPr>
+        <w:t xml:space="preserve"> </w:t>
+      </w:r>
+      <w:r>
+        <w:t>Роль в модели: субъект действий, создатель и исполнитель задач, участник организаций.</w:t>
+      </w:r>
+    </w:p>
+    <w:p>
+      <w:pPr>
+        <w:spacing w:after="100" w:line="360" w:lineRule="auto"/>
+        <w:ind w:firstLine="709"/>
+        <w:jc w:val="both"/>
+      </w:pPr>
+      <w:r>
+        <w:t>Organization представляет рабочий контур компании.</w:t>
+      </w:r>
+      <w:r>
+        <w:t xml:space="preserve"> </w:t>
+      </w:r>
+      <w:r>
+        <w:t>Свойства</w:t>
+      </w:r>
+      <w:r>
+        <w:rPr>
+          <w:lang w:val="en-US"/>
+        </w:rPr>
+        <w:t xml:space="preserve">: id, name, description, </w:t>
+      </w:r>
+      <w:proofErr w:type="spellStart"/>
+      <w:r>
+        <w:rPr>
+          <w:lang w:val="en-US"/>
+        </w:rPr>
+        <w:t>createdAt</w:t>
+      </w:r>
+      <w:proofErr w:type="spellEnd"/>
+      <w:r>
+        <w:rPr>
+          <w:lang w:val="en-US"/>
+        </w:rPr>
+        <w:t xml:space="preserve">, </w:t>
+      </w:r>
+      <w:proofErr w:type="spellStart"/>
+      <w:r>
+        <w:rPr>
+          <w:lang w:val="en-US"/>
+        </w:rPr>
+        <w:t>updatedAt</w:t>
+      </w:r>
+      <w:proofErr w:type="spellEnd"/>
+      <w:r>
+        <w:rPr>
+          <w:lang w:val="en-US"/>
+        </w:rPr>
+        <w:t>.</w:t>
+      </w:r>
+      <w:r>
+        <w:rPr>
+          <w:lang w:val="en-US"/>
+        </w:rPr>
+        <w:t xml:space="preserve"> </w:t>
+      </w:r>
+      <w:r>
+        <w:t>Роль в модели: агрегатор всех доменных объектов и граница данных.</w:t>
+      </w:r>
+    </w:p>
+    <w:p>
+      <w:pPr>
+        <w:spacing w:after="100" w:line="360" w:lineRule="auto"/>
+        <w:ind w:firstLine="709"/>
+        <w:jc w:val="both"/>
+      </w:pPr>
+      <w:proofErr w:type="spellStart"/>
+      <w:r>
+        <w:t>Membership</w:t>
+      </w:r>
+      <w:proofErr w:type="spellEnd"/>
+      <w:r>
+        <w:t xml:space="preserve"> представляет участие пользователя в организации.</w:t>
+      </w:r>
+      <w:r>
+        <w:t xml:space="preserve"> </w:t>
+      </w:r>
+      <w:r>
+        <w:t>Свойства</w:t>
+      </w:r>
+      <w:r>
+        <w:rPr>
+          <w:lang w:val="en-US"/>
+        </w:rPr>
+        <w:t xml:space="preserve">: id, role, title, </w:t>
+      </w:r>
+      <w:proofErr w:type="spellStart"/>
+      <w:r>
+        <w:rPr>
+          <w:lang w:val="en-US"/>
+        </w:rPr>
+        <w:t>isActive</w:t>
+      </w:r>
+      <w:proofErr w:type="spellEnd"/>
+      <w:r>
+        <w:rPr>
+          <w:lang w:val="en-US"/>
+        </w:rPr>
+        <w:t xml:space="preserve">, </w:t>
+      </w:r>
+      <w:proofErr w:type="spellStart"/>
+      <w:r>
+        <w:rPr>
+          <w:lang w:val="en-US"/>
+        </w:rPr>
+        <w:t>createdAt</w:t>
+      </w:r>
+      <w:proofErr w:type="spellEnd"/>
+      <w:r>
+        <w:rPr>
+          <w:lang w:val="en-US"/>
+        </w:rPr>
+        <w:t xml:space="preserve">, </w:t>
+      </w:r>
+      <w:proofErr w:type="spellStart"/>
+      <w:r>
+        <w:rPr>
+          <w:lang w:val="en-US"/>
+        </w:rPr>
+        <w:t>updatedAt</w:t>
+      </w:r>
+      <w:proofErr w:type="spellEnd"/>
+      <w:r>
+        <w:rPr>
+          <w:lang w:val="en-US"/>
+        </w:rPr>
+        <w:t>.</w:t>
+      </w:r>
+      <w:r>
+        <w:rPr>
+          <w:lang w:val="en-US"/>
+        </w:rPr>
+        <w:t xml:space="preserve"> </w:t>
+      </w:r>
+      <w:r>
+        <w:t>Роль в модели: связь пользователей и организаций с назначением роли.</w:t>
+      </w:r>
+    </w:p>
+    <w:p>
+      <w:pPr>
+        <w:spacing w:after="100" w:line="360" w:lineRule="auto"/>
+        <w:ind w:firstLine="709"/>
+        <w:jc w:val="both"/>
+      </w:pPr>
+      <w:r>
+        <w:rPr>
+          <w:lang w:val="en-US"/>
+        </w:rPr>
+        <w:t xml:space="preserve">Currency </w:t>
+      </w:r>
+      <w:r>
+        <w:t>представляет</w:t>
+      </w:r>
+      <w:r>
+        <w:rPr>
+          <w:lang w:val="en-US"/>
+        </w:rPr>
+        <w:t xml:space="preserve"> </w:t>
+      </w:r>
+      <w:r>
+        <w:t>валюту</w:t>
+      </w:r>
+      <w:r>
+        <w:rPr>
+          <w:lang w:val="en-US"/>
+        </w:rPr>
+        <w:t xml:space="preserve"> </w:t>
+      </w:r>
+      <w:proofErr w:type="spellStart"/>
+      <w:r>
+        <w:t>учета</w:t>
+      </w:r>
+      <w:proofErr w:type="spellEnd"/>
+      <w:r>
+        <w:rPr>
+          <w:lang w:val="en-US"/>
+        </w:rPr>
+        <w:t>.</w:t>
+      </w:r>
+      <w:r>
+        <w:rPr>
+          <w:lang w:val="en-US"/>
+        </w:rPr>
+        <w:t xml:space="preserve"> </w:t>
+      </w:r>
+      <w:r>
+        <w:t>Свойства</w:t>
+      </w:r>
+      <w:r>
+        <w:rPr>
+          <w:lang w:val="en-US"/>
+        </w:rPr>
+        <w:t xml:space="preserve">: id, code, name, symbol, </w:t>
+      </w:r>
+      <w:proofErr w:type="spellStart"/>
+      <w:r>
+        <w:rPr>
+          <w:lang w:val="en-US"/>
+        </w:rPr>
+        <w:t>exchangeRate</w:t>
+      </w:r>
+      <w:proofErr w:type="spellEnd"/>
+      <w:r>
+        <w:rPr>
+          <w:lang w:val="en-US"/>
+        </w:rPr>
+        <w:t>.</w:t>
+      </w:r>
+      <w:r>
+        <w:rPr>
+          <w:lang w:val="en-US"/>
+        </w:rPr>
+        <w:t xml:space="preserve"> </w:t>
+      </w:r>
+      <w:r>
+        <w:t>Роль в модели: денежная нормализация сумм.</w:t>
+      </w:r>
+    </w:p>
+    <w:p>
+      <w:pPr>
+        <w:spacing w:after="100" w:line="360" w:lineRule="auto"/>
+        <w:ind w:firstLine="709"/>
+        <w:jc w:val="both"/>
+      </w:pPr>
+      <w:proofErr w:type="spellStart"/>
+      <w:r>
+        <w:t>ContractType</w:t>
+      </w:r>
+      <w:proofErr w:type="spellEnd"/>
+      <w:r>
+        <w:t xml:space="preserve"> представляет классификацию договоров.</w:t>
+      </w:r>
+      <w:r>
+        <w:t xml:space="preserve"> </w:t>
+      </w:r>
+      <w:r>
+        <w:t>Свойства</w:t>
+      </w:r>
+      <w:r>
+        <w:t xml:space="preserve">: </w:t>
+      </w:r>
+      <w:r>
+        <w:rPr>
+          <w:lang w:val="en-US"/>
+        </w:rPr>
+        <w:t>id</w:t>
+      </w:r>
+      <w:r>
+        <w:t xml:space="preserve">, </w:t>
+      </w:r>
+      <w:r>
+        <w:rPr>
+          <w:lang w:val="en-US"/>
+        </w:rPr>
+        <w:t>name</w:t>
+      </w:r>
+      <w:r>
+        <w:t xml:space="preserve">, </w:t>
+      </w:r>
+      <w:r>
+        <w:rPr>
+          <w:lang w:val="en-US"/>
+        </w:rPr>
+        <w:t>description</w:t>
+      </w:r>
+      <w:r>
+        <w:t xml:space="preserve">, </w:t>
+      </w:r>
+      <w:proofErr w:type="spellStart"/>
+      <w:r>
+        <w:rPr>
+          <w:lang w:val="en-US"/>
+        </w:rPr>
+        <w:t>isActive</w:t>
+      </w:r>
+      <w:proofErr w:type="spellEnd"/>
+      <w:r>
+        <w:t>.</w:t>
+      </w:r>
+      <w:r>
+        <w:t xml:space="preserve"> </w:t>
+      </w:r>
+      <w:r>
+        <w:t>Роль в модели: шаблонизация и аналитическая группировка.</w:t>
+      </w:r>
+    </w:p>
+    <w:p>
+      <w:pPr>
+        <w:spacing w:after="100" w:line="360" w:lineRule="auto"/>
+        <w:ind w:firstLine="709"/>
+        <w:jc w:val="both"/>
+      </w:pPr>
+      <w:proofErr w:type="spellStart"/>
+      <w:r>
+        <w:t>Counterparty</w:t>
+      </w:r>
+      <w:proofErr w:type="spellEnd"/>
+      <w:r>
+        <w:t xml:space="preserve"> </w:t>
+      </w:r>
+      <w:r>
+        <w:t>представляет</w:t>
+      </w:r>
+      <w:r>
+        <w:t xml:space="preserve"> </w:t>
+      </w:r>
+      <w:r>
+        <w:t>контрагента</w:t>
+      </w:r>
+      <w:r>
+        <w:t>.</w:t>
+      </w:r>
+      <w:r>
+        <w:t xml:space="preserve"> </w:t>
+      </w:r>
+      <w:r>
+        <w:t>Свойства</w:t>
+      </w:r>
+      <w:r>
+        <w:rPr>
+          <w:lang w:val="en-US"/>
+        </w:rPr>
+        <w:t xml:space="preserve">: id, name, </w:t>
+      </w:r>
+      <w:proofErr w:type="spellStart"/>
+      <w:r>
+        <w:rPr>
+          <w:lang w:val="en-US"/>
+        </w:rPr>
+        <w:t>taxNumber</w:t>
+      </w:r>
+      <w:proofErr w:type="spellEnd"/>
+      <w:r>
+        <w:rPr>
+          <w:lang w:val="en-US"/>
+        </w:rPr>
+        <w:t xml:space="preserve">, kind, address, phone, email, </w:t>
+      </w:r>
+      <w:proofErr w:type="spellStart"/>
+      <w:r>
+        <w:rPr>
+          <w:lang w:val="en-US"/>
+        </w:rPr>
+        <w:t>bankDetails</w:t>
+      </w:r>
+      <w:proofErr w:type="spellEnd"/>
+      <w:r>
+        <w:rPr>
+          <w:lang w:val="en-US"/>
+        </w:rPr>
+        <w:t>.</w:t>
+      </w:r>
+      <w:r>
+        <w:rPr>
+          <w:lang w:val="en-US"/>
+        </w:rPr>
+        <w:t xml:space="preserve"> </w:t>
+      </w:r>
+      <w:r>
+        <w:t>Роль в модели: внешняя сторона договорного взаимодействия.</w:t>
+      </w:r>
+    </w:p>
+    <w:p>
+      <w:pPr>
+        <w:spacing w:after="100" w:line="360" w:lineRule="auto"/>
+        <w:ind w:firstLine="709"/>
+        <w:jc w:val="both"/>
+      </w:pPr>
+      <w:proofErr w:type="spellStart"/>
+      <w:r>
+        <w:t>DocumentTemplate</w:t>
+      </w:r>
+      <w:proofErr w:type="spellEnd"/>
+      <w:r>
+        <w:t xml:space="preserve"> </w:t>
+      </w:r>
+      <w:r>
+        <w:t>представляет</w:t>
+      </w:r>
+      <w:r>
+        <w:t xml:space="preserve"> </w:t>
+      </w:r>
+      <w:r>
+        <w:t>шаблон</w:t>
+      </w:r>
+      <w:r>
+        <w:t xml:space="preserve"> </w:t>
+      </w:r>
+      <w:r>
+        <w:t>документа</w:t>
+      </w:r>
+      <w:r>
+        <w:t>.</w:t>
+      </w:r>
+      <w:r>
+        <w:t xml:space="preserve"> </w:t>
+      </w:r>
+      <w:r>
+        <w:t>Свойства</w:t>
+      </w:r>
+      <w:r>
+        <w:rPr>
+          <w:lang w:val="en-US"/>
+        </w:rPr>
+        <w:t xml:space="preserve">: id, name, file, notes, </w:t>
+      </w:r>
+      <w:proofErr w:type="spellStart"/>
+      <w:r>
+        <w:rPr>
+          <w:lang w:val="en-US"/>
+        </w:rPr>
+        <w:t>isActive</w:t>
+      </w:r>
+      <w:proofErr w:type="spellEnd"/>
+      <w:r>
+        <w:rPr>
+          <w:lang w:val="en-US"/>
+        </w:rPr>
+        <w:t xml:space="preserve">, </w:t>
+      </w:r>
+      <w:proofErr w:type="spellStart"/>
+      <w:r>
+        <w:rPr>
+          <w:lang w:val="en-US"/>
+        </w:rPr>
+        <w:t>createdAt</w:t>
+      </w:r>
+      <w:proofErr w:type="spellEnd"/>
+      <w:r>
+        <w:rPr>
+          <w:lang w:val="en-US"/>
+        </w:rPr>
+        <w:t>.</w:t>
+      </w:r>
+      <w:r>
+        <w:rPr>
+          <w:lang w:val="en-US"/>
+        </w:rPr>
+        <w:t xml:space="preserve"> </w:t>
+      </w:r>
+      <w:r>
+        <w:t>Роль в модели: хранение типовых DOCX-форм.</w:t>
+      </w:r>
+    </w:p>
+    <w:p>
+      <w:pPr>
+        <w:spacing w:after="100" w:line="360" w:lineRule="auto"/>
+        <w:ind w:firstLine="709"/>
+        <w:jc w:val="both"/>
+      </w:pPr>
+      <w:proofErr w:type="spellStart"/>
+      <w:r>
+        <w:t>Contract</w:t>
+      </w:r>
+      <w:proofErr w:type="spellEnd"/>
+      <w:r>
+        <w:t xml:space="preserve"> представляет договор как основной объект жизненного цикла.</w:t>
+      </w:r>
+      <w:r>
+        <w:t xml:space="preserve"> </w:t>
+      </w:r>
+      <w:r>
+        <w:t>Свойства</w:t>
+      </w:r>
+      <w:r>
+        <w:rPr>
+          <w:lang w:val="en-US"/>
+        </w:rPr>
+        <w:t xml:space="preserve">: id, title, number, date, direction, amount, status, </w:t>
+      </w:r>
+      <w:proofErr w:type="spellStart"/>
+      <w:r>
+        <w:rPr>
+          <w:lang w:val="en-US"/>
+        </w:rPr>
+        <w:t>signedInRealLife</w:t>
+      </w:r>
+      <w:proofErr w:type="spellEnd"/>
+      <w:r>
+        <w:rPr>
+          <w:lang w:val="en-US"/>
+        </w:rPr>
+        <w:t xml:space="preserve">, </w:t>
+      </w:r>
+      <w:proofErr w:type="spellStart"/>
+      <w:r>
+        <w:rPr>
+          <w:lang w:val="en-US"/>
+        </w:rPr>
+        <w:t>signedMarkedAt</w:t>
+      </w:r>
+      <w:proofErr w:type="spellEnd"/>
+      <w:r>
+        <w:rPr>
+          <w:lang w:val="en-US"/>
+        </w:rPr>
+        <w:t xml:space="preserve">, </w:t>
+      </w:r>
+      <w:proofErr w:type="spellStart"/>
+      <w:r>
+        <w:rPr>
+          <w:lang w:val="en-US"/>
+        </w:rPr>
+        <w:t>signedComment</w:t>
+      </w:r>
+      <w:proofErr w:type="spellEnd"/>
+      <w:r>
+        <w:rPr>
+          <w:lang w:val="en-US"/>
+        </w:rPr>
+        <w:t xml:space="preserve">, </w:t>
+      </w:r>
+      <w:proofErr w:type="spellStart"/>
+      <w:r>
+        <w:rPr>
+          <w:lang w:val="en-US"/>
+        </w:rPr>
+        <w:t>budgetLimit</w:t>
+      </w:r>
+      <w:proofErr w:type="spellEnd"/>
+      <w:r>
+        <w:rPr>
+          <w:lang w:val="en-US"/>
+        </w:rPr>
+        <w:t>.</w:t>
+      </w:r>
+      <w:r>
+        <w:rPr>
+          <w:lang w:val="en-US"/>
+        </w:rPr>
+        <w:t xml:space="preserve"> </w:t>
+      </w:r>
+      <w:r>
+        <w:t xml:space="preserve">Методы: </w:t>
+      </w:r>
+      <w:proofErr w:type="spellStart"/>
+      <w:r>
+        <w:t>markSigned</w:t>
+      </w:r>
+      <w:proofErr w:type="spellEnd"/>
+      <w:r>
+        <w:t xml:space="preserve">(by, </w:t>
+      </w:r>
+      <w:proofErr w:type="spellStart"/>
+      <w:r>
+        <w:t>comm</w:t>
+      </w:r>
+      <w:proofErr w:type="spellEnd"/>
+      <w:r>
+        <w:t xml:space="preserve"> </w:t>
+      </w:r>
+      <w:proofErr w:type="spellStart"/>
+      <w:r>
+        <w:lastRenderedPageBreak/>
+        <w:t>ent</w:t>
+      </w:r>
+      <w:proofErr w:type="spellEnd"/>
+      <w:r>
+        <w:t xml:space="preserve">) — фиксирует факт реального подписания и кто </w:t>
+      </w:r>
+      <w:proofErr w:type="spellStart"/>
+      <w:r>
+        <w:t>внес</w:t>
+      </w:r>
+      <w:proofErr w:type="spellEnd"/>
+      <w:r>
+        <w:t xml:space="preserve"> отметку; changeStatus(</w:t>
+      </w:r>
+      <w:proofErr w:type="spellStart"/>
+      <w:r>
+        <w:t>status</w:t>
+      </w:r>
+      <w:proofErr w:type="spellEnd"/>
+      <w:r>
+        <w:t>) — переводит договор по стадиям процесса.</w:t>
+      </w:r>
+    </w:p>
+    <w:p>
+      <w:pPr>
+        <w:spacing w:after="100" w:line="360" w:lineRule="auto"/>
+        <w:ind w:firstLine="709"/>
+        <w:jc w:val="both"/>
+      </w:pPr>
+      <w:proofErr w:type="spellStart"/>
+      <w:r>
+        <w:t>ContractVersion</w:t>
+      </w:r>
+      <w:proofErr w:type="spellEnd"/>
+      <w:r>
+        <w:t xml:space="preserve"> представляет снимок версии договора.</w:t>
+      </w:r>
+      <w:r>
+        <w:t xml:space="preserve"> </w:t>
+      </w:r>
+      <w:r>
+        <w:t>Свойства</w:t>
+      </w:r>
+      <w:r>
+        <w:rPr>
+          <w:lang w:val="en-US"/>
+        </w:rPr>
+        <w:t xml:space="preserve">: id, </w:t>
+      </w:r>
+      <w:proofErr w:type="spellStart"/>
+      <w:r>
+        <w:rPr>
+          <w:lang w:val="en-US"/>
+        </w:rPr>
+        <w:t>versionNumber</w:t>
+      </w:r>
+      <w:proofErr w:type="spellEnd"/>
+      <w:r>
+        <w:rPr>
+          <w:lang w:val="en-US"/>
+        </w:rPr>
+        <w:t xml:space="preserve">, snapshot, reason, </w:t>
+      </w:r>
+      <w:proofErr w:type="spellStart"/>
+      <w:r>
+        <w:rPr>
+          <w:lang w:val="en-US"/>
+        </w:rPr>
+        <w:t>createdAt</w:t>
+      </w:r>
+      <w:proofErr w:type="spellEnd"/>
+      <w:r>
+        <w:rPr>
+          <w:lang w:val="en-US"/>
+        </w:rPr>
+        <w:t>.</w:t>
+      </w:r>
+      <w:r>
+        <w:rPr>
+          <w:lang w:val="en-US"/>
+        </w:rPr>
+        <w:t xml:space="preserve"> </w:t>
+      </w:r>
+      <w:r>
+        <w:t>Роль в модели: аудит изменений и откат к историческим состояниям.</w:t>
+      </w:r>
+    </w:p>
+    <w:p>
+      <w:pPr>
+        <w:spacing w:after="100" w:line="360" w:lineRule="auto"/>
+        <w:ind w:firstLine="709"/>
+        <w:jc w:val="both"/>
+      </w:pPr>
+      <w:proofErr w:type="spellStart"/>
+      <w:r>
+        <w:t>ContractStage</w:t>
+      </w:r>
+      <w:proofErr w:type="spellEnd"/>
+      <w:r>
+        <w:t xml:space="preserve"> представляет этап исполнения договора.</w:t>
+      </w:r>
+      <w:r>
+        <w:t xml:space="preserve"> </w:t>
+      </w:r>
+      <w:r>
+        <w:t>Свойства</w:t>
+      </w:r>
+      <w:r>
+        <w:rPr>
+          <w:lang w:val="en-US"/>
+        </w:rPr>
+        <w:t xml:space="preserve">: id, name, </w:t>
+      </w:r>
+      <w:proofErr w:type="spellStart"/>
+      <w:r>
+        <w:rPr>
+          <w:lang w:val="en-US"/>
+        </w:rPr>
+        <w:t>dueDate</w:t>
+      </w:r>
+      <w:proofErr w:type="spellEnd"/>
+      <w:r>
+        <w:rPr>
+          <w:lang w:val="en-US"/>
+        </w:rPr>
+        <w:t>, amount, status, position.</w:t>
+      </w:r>
+      <w:r>
+        <w:rPr>
+          <w:lang w:val="en-US"/>
+        </w:rPr>
+        <w:t xml:space="preserve"> </w:t>
+      </w:r>
+      <w:r>
+        <w:t>Роль в модели: детализация выполнения по этапам/суммам/срокам.</w:t>
+      </w:r>
+    </w:p>
+    <w:p>
+      <w:pPr>
+        <w:spacing w:after="100" w:line="360" w:lineRule="auto"/>
+        <w:ind w:firstLine="709"/>
+        <w:jc w:val="both"/>
+      </w:pPr>
+      <w:proofErr w:type="spellStart"/>
+      <w:r>
+        <w:t>Attachment</w:t>
+      </w:r>
+      <w:proofErr w:type="spellEnd"/>
+      <w:r>
+        <w:t xml:space="preserve"> представляет вложение к договору.</w:t>
+      </w:r>
+      <w:r>
+        <w:t xml:space="preserve"> </w:t>
+      </w:r>
+      <w:r>
+        <w:t>Свойства</w:t>
+      </w:r>
+      <w:r>
+        <w:rPr>
+          <w:lang w:val="en-US"/>
+        </w:rPr>
+        <w:t xml:space="preserve">: id, kind, title, file, note, </w:t>
+      </w:r>
+      <w:proofErr w:type="spellStart"/>
+      <w:r>
+        <w:rPr>
+          <w:lang w:val="en-US"/>
+        </w:rPr>
+        <w:t>createdAt</w:t>
+      </w:r>
+      <w:proofErr w:type="spellEnd"/>
+      <w:r>
+        <w:rPr>
+          <w:lang w:val="en-US"/>
+        </w:rPr>
+        <w:t>.</w:t>
+      </w:r>
+      <w:r>
+        <w:rPr>
+          <w:lang w:val="en-US"/>
+        </w:rPr>
+        <w:t xml:space="preserve"> </w:t>
+      </w:r>
+      <w:r>
+        <w:t>Роль в модели: прикрепление подтверждающих файлов.</w:t>
+      </w:r>
+    </w:p>
+    <w:p>
+      <w:pPr>
+        <w:spacing w:after="100" w:line="360" w:lineRule="auto"/>
+        <w:ind w:firstLine="709"/>
+        <w:jc w:val="both"/>
+      </w:pPr>
+      <w:proofErr w:type="spellStart"/>
+      <w:r>
+        <w:t>Estimate</w:t>
+      </w:r>
+      <w:proofErr w:type="spellEnd"/>
+      <w:r>
+        <w:t xml:space="preserve"> представляет смету по договору.</w:t>
+      </w:r>
+      <w:r>
+        <w:t xml:space="preserve"> </w:t>
+      </w:r>
+      <w:r>
+        <w:t>Свойства</w:t>
+      </w:r>
+      <w:r>
+        <w:rPr>
+          <w:lang w:val="en-US"/>
+        </w:rPr>
+        <w:t xml:space="preserve">: id, title, status, </w:t>
+      </w:r>
+      <w:proofErr w:type="spellStart"/>
+      <w:r>
+        <w:rPr>
+          <w:lang w:val="en-US"/>
+        </w:rPr>
+        <w:t>currentVersionNumber</w:t>
+      </w:r>
+      <w:proofErr w:type="spellEnd"/>
+      <w:r>
+        <w:rPr>
+          <w:lang w:val="en-US"/>
+        </w:rPr>
+        <w:t xml:space="preserve">, </w:t>
+      </w:r>
+      <w:proofErr w:type="spellStart"/>
+      <w:r>
+        <w:rPr>
+          <w:lang w:val="en-US"/>
+        </w:rPr>
+        <w:t>latestTotalAmount</w:t>
+      </w:r>
+      <w:proofErr w:type="spellEnd"/>
+      <w:r>
+        <w:rPr>
+          <w:lang w:val="en-US"/>
+        </w:rPr>
+        <w:t xml:space="preserve">, </w:t>
+      </w:r>
+      <w:proofErr w:type="spellStart"/>
+      <w:r>
+        <w:rPr>
+          <w:lang w:val="en-US"/>
+        </w:rPr>
+        <w:t>createdAt</w:t>
+      </w:r>
+      <w:proofErr w:type="spellEnd"/>
+      <w:r>
+        <w:rPr>
+          <w:lang w:val="en-US"/>
+        </w:rPr>
+        <w:t xml:space="preserve">, </w:t>
+      </w:r>
+      <w:proofErr w:type="spellStart"/>
+      <w:r>
+        <w:rPr>
+          <w:lang w:val="en-US"/>
+        </w:rPr>
+        <w:t>updatedAt</w:t>
+      </w:r>
+      <w:proofErr w:type="spellEnd"/>
+      <w:r>
+        <w:rPr>
+          <w:lang w:val="en-US"/>
+        </w:rPr>
+        <w:t>.</w:t>
+      </w:r>
+      <w:r>
+        <w:rPr>
+          <w:lang w:val="en-US"/>
+        </w:rPr>
+        <w:t xml:space="preserve"> </w:t>
+      </w:r>
+      <w:r>
+        <w:t xml:space="preserve">Метод: </w:t>
+      </w:r>
+      <w:proofErr w:type="spellStart"/>
+      <w:r>
+        <w:t>recalculateTotal</w:t>
+      </w:r>
+      <w:proofErr w:type="spellEnd"/>
+      <w:r>
+        <w:t xml:space="preserve">() — </w:t>
+      </w:r>
+      <w:proofErr w:type="spellStart"/>
+      <w:r>
+        <w:t>пересчет</w:t>
+      </w:r>
+      <w:proofErr w:type="spellEnd"/>
+      <w:r>
+        <w:t xml:space="preserve"> актуальной суммы по текущей версии/составу.</w:t>
+      </w:r>
+    </w:p>
+    <w:p>
+      <w:pPr>
+        <w:spacing w:after="100" w:line="360" w:lineRule="auto"/>
+        <w:ind w:firstLine="709"/>
+        <w:jc w:val="both"/>
+        <w:rPr>
+          <w:lang w:val="en-US"/>
+        </w:rPr>
+      </w:pPr>
+      <w:proofErr w:type="spellStart"/>
+      <w:r>
+        <w:t>EstimateVersion</w:t>
+      </w:r>
+      <w:proofErr w:type="spellEnd"/>
+      <w:r>
+        <w:t xml:space="preserve"> </w:t>
+      </w:r>
+      <w:r>
+        <w:t>представляет</w:t>
+      </w:r>
+      <w:r>
+        <w:t xml:space="preserve"> </w:t>
+      </w:r>
+      <w:r>
+        <w:t>версию</w:t>
+      </w:r>
+      <w:r>
+        <w:t xml:space="preserve"> </w:t>
+      </w:r>
+      <w:r>
+        <w:t>сметы</w:t>
+      </w:r>
+      <w:r>
+        <w:t>.</w:t>
+      </w:r>
+      <w:r>
+        <w:t xml:space="preserve"> </w:t>
+      </w:r>
+      <w:r>
+        <w:t>Свойства</w:t>
+      </w:r>
+      <w:r>
+        <w:rPr>
+          <w:lang w:val="en-US"/>
+        </w:rPr>
+        <w:t xml:space="preserve">: id, </w:t>
+      </w:r>
+      <w:proofErr w:type="spellStart"/>
+      <w:r>
+        <w:rPr>
+          <w:lang w:val="en-US"/>
+        </w:rPr>
+        <w:t>versionNumber</w:t>
+      </w:r>
+      <w:proofErr w:type="spellEnd"/>
+      <w:r>
+        <w:rPr>
+          <w:lang w:val="en-US"/>
+        </w:rPr>
+        <w:t xml:space="preserve">, file, </w:t>
+      </w:r>
+      <w:proofErr w:type="spellStart"/>
+      <w:r>
+        <w:rPr>
+          <w:lang w:val="en-US"/>
+        </w:rPr>
+        <w:t>totalAmount</w:t>
+      </w:r>
+      <w:proofErr w:type="spellEnd"/>
+      <w:r>
+        <w:rPr>
+          <w:lang w:val="en-US"/>
+        </w:rPr>
+        <w:t xml:space="preserve">, status, notes, </w:t>
+      </w:r>
+      <w:proofErr w:type="spellStart"/>
+      <w:r>
+        <w:rPr>
+          <w:lang w:val="en-US"/>
+        </w:rPr>
+        <w:t>isCurrent</w:t>
+      </w:r>
+      <w:proofErr w:type="spellEnd"/>
+      <w:r>
+        <w:rPr>
+          <w:lang w:val="en-US"/>
+        </w:rPr>
+        <w:t xml:space="preserve">, </w:t>
+      </w:r>
+      <w:proofErr w:type="spellStart"/>
+      <w:r>
+        <w:rPr>
+          <w:lang w:val="en-US"/>
+        </w:rPr>
+        <w:t>createdAt</w:t>
+      </w:r>
+      <w:proofErr w:type="spellEnd"/>
+      <w:r>
+        <w:rPr>
+          <w:lang w:val="en-US"/>
+        </w:rPr>
+        <w:t>.</w:t>
+      </w:r>
+    </w:p>
+    <w:p>
+      <w:pPr>
+        <w:spacing w:after="100" w:line="360" w:lineRule="auto"/>
+        <w:ind w:firstLine="709"/>
+        <w:jc w:val="both"/>
+        <w:rPr>
+          <w:lang w:val="en-US"/>
+        </w:rPr>
+      </w:pPr>
+      <w:r>
+        <w:t xml:space="preserve">Роль в модели: </w:t>
+      </w:r>
+      <w:proofErr w:type="spellStart"/>
+      <w:r>
+        <w:t>версионирование</w:t>
+      </w:r>
+      <w:proofErr w:type="spellEnd"/>
+      <w:r>
+        <w:t xml:space="preserve"> и контроль редакций смет.</w:t>
+      </w:r>
+      <w:r>
+        <w:t xml:space="preserve"> </w:t>
+      </w:r>
+      <w:proofErr w:type="spellStart"/>
+      <w:r>
+        <w:rPr>
+          <w:lang w:val="en-US"/>
+        </w:rPr>
+        <w:t>ApprovalTask</w:t>
+      </w:r>
+      <w:proofErr w:type="spellEnd"/>
+      <w:r>
+        <w:rPr>
+          <w:lang w:val="en-US"/>
+        </w:rPr>
+        <w:t xml:space="preserve"> </w:t>
+      </w:r>
+      <w:r>
+        <w:t>представляет</w:t>
+      </w:r>
+      <w:r>
+        <w:rPr>
+          <w:lang w:val="en-US"/>
+        </w:rPr>
+        <w:t xml:space="preserve"> </w:t>
+      </w:r>
+      <w:r>
+        <w:t>задачу</w:t>
+      </w:r>
+      <w:r>
+        <w:rPr>
+          <w:lang w:val="en-US"/>
+        </w:rPr>
+        <w:t xml:space="preserve"> </w:t>
+      </w:r>
+      <w:r>
+        <w:t>согласования</w:t>
+      </w:r>
+      <w:r>
+        <w:rPr>
+          <w:lang w:val="en-US"/>
+        </w:rPr>
+        <w:t>.</w:t>
+      </w:r>
+      <w:r>
+        <w:rPr>
+          <w:lang w:val="en-US"/>
+        </w:rPr>
+        <w:t xml:space="preserve"> </w:t>
+      </w:r>
+      <w:r>
+        <w:t>Свойства</w:t>
+      </w:r>
+      <w:r>
+        <w:rPr>
+          <w:lang w:val="en-US"/>
+        </w:rPr>
+        <w:t xml:space="preserve">: id, </w:t>
+      </w:r>
+      <w:proofErr w:type="spellStart"/>
+      <w:r>
+        <w:rPr>
+          <w:lang w:val="en-US"/>
+        </w:rPr>
+        <w:t>requiredRole</w:t>
+      </w:r>
+      <w:proofErr w:type="spellEnd"/>
+      <w:r>
+        <w:rPr>
+          <w:lang w:val="en-US"/>
+        </w:rPr>
+        <w:t xml:space="preserve">, </w:t>
+      </w:r>
+      <w:proofErr w:type="spellStart"/>
+      <w:r>
+        <w:rPr>
+          <w:lang w:val="en-US"/>
+        </w:rPr>
+        <w:t>taskType</w:t>
+      </w:r>
+      <w:proofErr w:type="spellEnd"/>
+      <w:r>
+        <w:rPr>
+          <w:lang w:val="en-US"/>
+        </w:rPr>
+        <w:t xml:space="preserve">, title, notes, status, </w:t>
+      </w:r>
+      <w:proofErr w:type="spellStart"/>
+      <w:r>
+        <w:rPr>
+          <w:lang w:val="en-US"/>
+        </w:rPr>
+        <w:t>decisionComment</w:t>
+      </w:r>
+      <w:proofErr w:type="spellEnd"/>
+      <w:r>
+        <w:rPr>
+          <w:lang w:val="en-US"/>
+        </w:rPr>
+        <w:t xml:space="preserve">, deadline, </w:t>
+      </w:r>
+      <w:proofErr w:type="spellStart"/>
+      <w:r>
+        <w:rPr>
+          <w:lang w:val="en-US"/>
+        </w:rPr>
+        <w:t>decidedAt</w:t>
+      </w:r>
+      <w:proofErr w:type="spellEnd"/>
+      <w:r>
+        <w:rPr>
+          <w:lang w:val="en-US"/>
+        </w:rPr>
+        <w:t>, sequence.</w:t>
+      </w:r>
+    </w:p>
+    <w:p>
+      <w:pPr>
+        <w:spacing w:after="100" w:line="360" w:lineRule="auto"/>
+        <w:ind w:firstLine="709"/>
+        <w:jc w:val="both"/>
+      </w:pPr>
+      <w:r>
+        <w:t xml:space="preserve">Методы: </w:t>
+      </w:r>
+      <w:proofErr w:type="spellStart"/>
+      <w:r>
+        <w:t>approve</w:t>
+      </w:r>
+      <w:proofErr w:type="spellEnd"/>
+      <w:r>
+        <w:t>(</w:t>
+      </w:r>
+      <w:proofErr w:type="spellStart"/>
+      <w:r>
+        <w:t>comment</w:t>
+      </w:r>
+      <w:proofErr w:type="spellEnd"/>
+      <w:r>
+        <w:t xml:space="preserve">) — подтверждение шага согласования; </w:t>
+      </w:r>
+      <w:proofErr w:type="spellStart"/>
+      <w:r>
+        <w:t>reject</w:t>
+      </w:r>
+      <w:proofErr w:type="spellEnd"/>
+      <w:r>
+        <w:t>(</w:t>
+      </w:r>
+      <w:proofErr w:type="spellStart"/>
+      <w:r>
+        <w:t>comment</w:t>
+      </w:r>
+      <w:proofErr w:type="spellEnd"/>
+      <w:r>
+        <w:t>) — отклонение с обязательной фиксацией причины.</w:t>
+      </w:r>
+      <w:r>
+        <w:t xml:space="preserve"> </w:t>
+      </w:r>
+      <w:r>
+        <w:t>Роль в модели: формализация маршрута согласования между юристом, финансистом, директором и др.</w:t>
+      </w:r>
+    </w:p>
+    <w:p>
+      <w:pPr>
+        <w:spacing w:after="100" w:line="360" w:lineRule="auto"/>
+        <w:ind w:firstLine="709"/>
+        <w:jc w:val="both"/>
+      </w:pPr>
+      <w:r>
+        <w:rPr>
+          <w:lang w:val="en-US"/>
+        </w:rPr>
+        <w:t xml:space="preserve">Payment </w:t>
+      </w:r>
+      <w:r>
+        <w:t>представляет</w:t>
+      </w:r>
+      <w:r>
+        <w:rPr>
+          <w:lang w:val="en-US"/>
+        </w:rPr>
+        <w:t xml:space="preserve"> </w:t>
+      </w:r>
+      <w:proofErr w:type="spellStart"/>
+      <w:r>
+        <w:t>платежное</w:t>
+      </w:r>
+      <w:proofErr w:type="spellEnd"/>
+      <w:r>
+        <w:rPr>
+          <w:lang w:val="en-US"/>
+        </w:rPr>
+        <w:t xml:space="preserve"> </w:t>
+      </w:r>
+      <w:r>
+        <w:t>событие</w:t>
+      </w:r>
+      <w:r>
+        <w:rPr>
+          <w:lang w:val="en-US"/>
+        </w:rPr>
+        <w:t>.</w:t>
+      </w:r>
+      <w:r>
+        <w:rPr>
+          <w:lang w:val="en-US"/>
+        </w:rPr>
+        <w:t xml:space="preserve"> </w:t>
+      </w:r>
+      <w:r>
+        <w:t>Свойства</w:t>
+      </w:r>
+      <w:r>
+        <w:rPr>
+          <w:lang w:val="en-US"/>
+        </w:rPr>
+        <w:t xml:space="preserve">: id, direction, </w:t>
+      </w:r>
+      <w:proofErr w:type="spellStart"/>
+      <w:r>
+        <w:rPr>
+          <w:lang w:val="en-US"/>
+        </w:rPr>
+        <w:t>plannedDate</w:t>
+      </w:r>
+      <w:proofErr w:type="spellEnd"/>
+      <w:r>
+        <w:rPr>
+          <w:lang w:val="en-US"/>
+        </w:rPr>
+        <w:t xml:space="preserve">, </w:t>
+      </w:r>
+      <w:proofErr w:type="spellStart"/>
+      <w:r>
+        <w:rPr>
+          <w:lang w:val="en-US"/>
+        </w:rPr>
+        <w:t>actualDate</w:t>
+      </w:r>
+      <w:proofErr w:type="spellEnd"/>
+      <w:r>
+        <w:rPr>
+          <w:lang w:val="en-US"/>
+        </w:rPr>
+        <w:t xml:space="preserve">, amount, status, </w:t>
+      </w:r>
+      <w:proofErr w:type="spellStart"/>
+      <w:r>
+        <w:rPr>
+          <w:lang w:val="en-US"/>
+        </w:rPr>
+        <w:t>paymentOrderNumber</w:t>
+      </w:r>
+      <w:proofErr w:type="spellEnd"/>
+      <w:r>
+        <w:rPr>
+          <w:lang w:val="en-US"/>
+        </w:rPr>
+        <w:t>, note.</w:t>
+      </w:r>
+      <w:r>
+        <w:rPr>
+          <w:lang w:val="en-US"/>
+        </w:rPr>
+        <w:t xml:space="preserve"> </w:t>
+      </w:r>
+      <w:r>
+        <w:t xml:space="preserve">Метод: </w:t>
+      </w:r>
+      <w:proofErr w:type="spellStart"/>
+      <w:r>
+        <w:lastRenderedPageBreak/>
+        <w:t>updateStatus</w:t>
+      </w:r>
+      <w:proofErr w:type="spellEnd"/>
+      <w:r>
+        <w:t>() — вычисляет текущий статус (план/оплачен/просрочен/отменен) по датам и факту оплаты.</w:t>
+      </w:r>
+    </w:p>
+    <w:p>
+      <w:pPr>
+        <w:spacing w:after="100" w:line="360" w:lineRule="auto"/>
+        <w:ind w:firstLine="709"/>
+        <w:jc w:val="both"/>
+      </w:pPr>
+      <w:proofErr w:type="spellStart"/>
+      <w:r>
+        <w:t>Notification</w:t>
+      </w:r>
+      <w:proofErr w:type="spellEnd"/>
+      <w:r>
+        <w:t xml:space="preserve"> представляет уведомление пользователя.</w:t>
+      </w:r>
+      <w:r>
+        <w:t xml:space="preserve"> </w:t>
+      </w:r>
+      <w:r>
+        <w:t>Свойства</w:t>
+      </w:r>
+      <w:r>
+        <w:rPr>
+          <w:lang w:val="en-US"/>
+        </w:rPr>
+        <w:t xml:space="preserve">: id, title, message, kind, </w:t>
+      </w:r>
+      <w:proofErr w:type="spellStart"/>
+      <w:r>
+        <w:rPr>
+          <w:lang w:val="en-US"/>
+        </w:rPr>
+        <w:t>isRead</w:t>
+      </w:r>
+      <w:proofErr w:type="spellEnd"/>
+      <w:r>
+        <w:rPr>
+          <w:lang w:val="en-US"/>
+        </w:rPr>
+        <w:t>.</w:t>
+      </w:r>
+      <w:r>
+        <w:rPr>
+          <w:lang w:val="en-US"/>
+        </w:rPr>
+        <w:t xml:space="preserve"> </w:t>
+      </w:r>
+      <w:r>
+        <w:t xml:space="preserve">Метод: </w:t>
+      </w:r>
+      <w:proofErr w:type="spellStart"/>
+      <w:r>
+        <w:t>markRead</w:t>
+      </w:r>
+      <w:proofErr w:type="spellEnd"/>
+      <w:r>
+        <w:t>() — пометка уведомления как прочитанного.</w:t>
+      </w:r>
+      <w:r>
+        <w:t xml:space="preserve"> </w:t>
+      </w:r>
+    </w:p>
+    <w:p>
+      <w:pPr>
+        <w:spacing w:after="100" w:line="360" w:lineRule="auto"/>
+        <w:ind w:firstLine="709"/>
+        <w:jc w:val="both"/>
+        <w:rPr>
+          <w:lang w:val="en-US"/>
+        </w:rPr>
+      </w:pPr>
+      <w:proofErr w:type="spellStart"/>
+      <w:r>
+        <w:rPr>
+          <w:lang w:val="en-US"/>
+        </w:rPr>
+        <w:t>ActivityLog</w:t>
+      </w:r>
+      <w:proofErr w:type="spellEnd"/>
+      <w:r>
+        <w:rPr>
+          <w:lang w:val="en-US"/>
+        </w:rPr>
+        <w:t xml:space="preserve"> </w:t>
+      </w:r>
+      <w:r>
+        <w:t>представляет</w:t>
+      </w:r>
+      <w:r>
+        <w:rPr>
+          <w:lang w:val="en-US"/>
+        </w:rPr>
+        <w:t xml:space="preserve"> </w:t>
+      </w:r>
+      <w:r>
+        <w:t>аудит</w:t>
+      </w:r>
+      <w:r>
+        <w:rPr>
+          <w:lang w:val="en-US"/>
+        </w:rPr>
+        <w:t>-</w:t>
+      </w:r>
+      <w:r>
+        <w:t>действие</w:t>
+      </w:r>
+      <w:r>
+        <w:rPr>
+          <w:lang w:val="en-US"/>
+        </w:rPr>
+        <w:t>.</w:t>
+      </w:r>
+      <w:r>
+        <w:t>Свойства</w:t>
+      </w:r>
+      <w:r>
+        <w:rPr>
+          <w:lang w:val="en-US"/>
+        </w:rPr>
+        <w:t xml:space="preserve">: id, action, </w:t>
+      </w:r>
+      <w:proofErr w:type="spellStart"/>
+      <w:r>
+        <w:rPr>
+          <w:lang w:val="en-US"/>
+        </w:rPr>
+        <w:t>entityType</w:t>
+      </w:r>
+      <w:proofErr w:type="spellEnd"/>
+      <w:r>
+        <w:rPr>
+          <w:lang w:val="en-US"/>
+        </w:rPr>
+        <w:t xml:space="preserve">, </w:t>
+      </w:r>
+      <w:proofErr w:type="spellStart"/>
+      <w:r>
+        <w:rPr>
+          <w:lang w:val="en-US"/>
+        </w:rPr>
+        <w:t>entityId</w:t>
+      </w:r>
+      <w:proofErr w:type="spellEnd"/>
+      <w:r>
+        <w:rPr>
+          <w:lang w:val="en-US"/>
+        </w:rPr>
+        <w:t xml:space="preserve">, description, metadata, </w:t>
+      </w:r>
+      <w:proofErr w:type="spellStart"/>
+      <w:r>
+        <w:rPr>
+          <w:lang w:val="en-US"/>
+        </w:rPr>
+        <w:t>createdAt</w:t>
+      </w:r>
+      <w:proofErr w:type="spellEnd"/>
+      <w:r>
+        <w:rPr>
+          <w:lang w:val="en-US"/>
+        </w:rPr>
+        <w:t>.</w:t>
+      </w:r>
+      <w:r>
+        <w:rPr>
+          <w:lang w:val="en-US"/>
+        </w:rPr>
+        <w:t xml:space="preserve"> </w:t>
+      </w:r>
+      <w:r>
+        <w:t>Роль в модели: прозрачность и воспроизводимость операций.</w:t>
+      </w:r>
+    </w:p>
+    <w:p>
+      <w:pPr>
+        <w:spacing w:after="100" w:line="360" w:lineRule="auto"/>
+        <w:ind w:firstLine="709"/>
+        <w:jc w:val="both"/>
+      </w:pPr>
+    </w:p>
+    <w:p>
+      <w:pPr>
+        <w:jc w:val="center"/>
+      </w:pPr>
       <w:r>
         <w:br w:type="page"/>
       </w:r>
@@ -21231,15 +22836,7 @@
             </w:r>
             <w:proofErr w:type="spellEnd"/>
             <w:r>
-              <w:t>)</w:t>
-            </w:r>
-            <w:proofErr w:type="gramStart"/>
-            <w:r>
-              <w:t>, Расторгнут</w:t>
-            </w:r>
-            <w:proofErr w:type="gramEnd"/>
-            <w:r>
-              <w:t xml:space="preserve"> (</w:t>
+              <w:t>), Расторгнут (</w:t>
             </w:r>
             <w:proofErr w:type="spellStart"/>
             <w:r>
@@ -23295,6 +24892,7 @@
   </w:style>
   <w:style w:type="paragraph" w:styleId="2">
     <w:name w:val="heading 2"/>
+    <w:link w:val="20"/>
     <w:uiPriority w:val="9"/>
     <w:unhideWhenUsed/>
     <w:qFormat/>
@@ -23493,7 +25091,7 @@
       <w:spacing w:after="100"/>
     </w:pPr>
   </w:style>
-  <w:style w:type="paragraph" w:styleId="20">
+  <w:style w:type="paragraph" w:styleId="21">
     <w:name w:val="toc 2"/>
     <w:basedOn w:val="a"/>
     <w:next w:val="a"/>
@@ -23560,6 +25158,17 @@
     <w:link w:val="ae"/>
     <w:uiPriority w:val="99"/>
     <w:rsid w:val="0062389A"/>
+  </w:style>
+  <w:style w:type="character" w:customStyle="1" w:styleId="20">
+    <w:name w:val="Заголовок 2 Знак"/>
+    <w:basedOn w:val="a0"/>
+    <w:link w:val="2"/>
+    <w:uiPriority w:val="9"/>
+    <w:rsid w:val="00C9488D"/>
+    <w:rPr>
+      <w:b/>
+      <w:bCs/>
+    </w:rPr>
   </w:style>
 </w:styles>
 </file>

</xml_diff>